<commit_message>
Supplementary Text: replace placeholders with the completed analyses
Notes 1 and Figures 3-5 now carry results rather than intent. Note 2 (AM1-BCC)
remains a placeholder pending that run.

Co-Authored-By: Claude Opus 5 <noreply@anthropic.com>
</commit_message>
<xml_diff>
--- a/revisions/Supplementary-Text-Revision-1.docx
+++ b/revisions/Supplementary-Text-Revision-1.docx
@@ -733,7 +733,7 @@
         <w:rPr>
           <w:color w:val="FF0000"/>
         </w:rPr>
-        <w:t xml:space="preserve">Supplementary Note 1. Finite-size corrections for the charge-changing legs. Magnitude of the net-charge undersolvation and discrete-solvent terms of the Rocklin scheme for the WT→K103N and WT→G190E legs, which were not applied in the reported free energies. Addresses Reviewer 2, comment 4.</w:t>
+        <w:t xml:space="preserve">Supplementary Note 1. Finite-size corrections for the charge-changing legs. The leading periodicity (net-charge self-energy) term of the Rocklin scheme is +0.0407 kcal/mol per phase and cancels to below 0.0001 kcal/mol in ΔΔGbind for both WT→K103N and WT→G190E. The higher-order terms — net-charge undersolvation, discrete-solvent and residual integrated potential — were not applied, since computing them exactly requires a Poisson-Boltzmann treatment of each environment. They are bounded instead by cancellation: each depends on the net charge, the box, the solvent density and the solute excluded volume; the charge change is identical in the holo and apo phases by construction; and the cells are matched to within 0.13% (K103N) and 0.31% (G190E) in volume, with DOR occupying 0.019% of the cell. Taking a per-phase correction of 1 kcal/mol, about 25 times the leading term, the residual on ΔΔGbind is at most 0.003 kcal/mol — two to three orders of magnitude below the 0.2–1.2 kcal/mol per-leg statistical uncertainties in Table 2.</w:t>
       </w:r>
     </w:p>
     <w:p>
@@ -755,7 +755,7 @@
         <w:rPr>
           <w:color w:val="FF0000"/>
         </w:rPr>
-        <w:t xml:space="preserve">Supplementary Figure 3. Convergence diagnostics: block averages, autocorrelation times and effective sample sizes for the structural observables and for the MM/GBSA and FEP estimates. Addresses Reviewer 2, comment 1.</w:t>
+        <w:t xml:space="preserve">Supplementary Figure 3. Convergence diagnostics. Block averages over the production trajectories, together with integrated autocorrelation times estimated by Geyer's initial positive sequence and the resulting effective sample sizes, for six structural observables across all 60 holo replicates. Median autocorrelation times are 1.0–3.7 ns, giving a median effective sample size of 14–50 per 100 ns replicate; per-genotype median values range from 8 (V106M) to 73 (F227C). These bound the precision of the reported replicate means. They do not establish that the sampled basin is the only relevant one: an autocorrelation time measures motion within the basin a replicate occupies, so a trajectory that never leaves its starting basin can show a short correlation time and a healthy effective sample size regardless.</w:t>
       </w:r>
     </w:p>
     <w:p>
@@ -766,7 +766,7 @@
         <w:rPr>
           <w:color w:val="FF0000"/>
         </w:rPr>
-        <w:t xml:space="preserve">Supplementary Figure 4. Protein-level conformational analysis: per-residue RMSF, secondary-structure changes and NNIBP conformational distributions, WT-referenced across the panel. Addresses Reviewer 1, comment 4.</w:t>
+        <w:t xml:space="preserve">Supplementary Figure 4. Protein-level conformational analysis. Per-residue Cα RMSF after superposition on the NNIBP-lining residues, and three-state secondary structure by DSSP, both referenced to wild type across the panel. Regional RMSF changes reach at most 0.25 Å, in the primer grip (225–235) and the β9–β10 sheet for Y181C and G190S, and secondary structure is essentially unchanged throughout, the largest shift being G190E losing 0.08 of strand character at the NNIBP lining. No genotype remodels the fold in the bound state, which indicates that the differences in Table 3 are local to the DOR interface rather than consequences of broader conformational change.</w:t>
       </w:r>
     </w:p>
     <w:p>
@@ -777,7 +777,7 @@
         <w:rPr>
           <w:color w:val="FF0000"/>
         </w:rPr>
-        <w:t xml:space="preserve">Supplementary Figure 5. Apo and holo pocket ensembles for the genotypes where ΔΔGbind misses the phenotype. Addresses Reviewer 1, comments 2 and 3.</w:t>
+        <w:t xml:space="preserve">Supplementary Figure 5. Apo and holo NNIBP volume distributions. Per-frame pocket volume for the bound state over full production, and for the unliganded state over a matched 10 ns window, since the wild-type apo trajectories are 10 ns and serve as the reference. The unliganded pocket is substantially collapsed relative to the bound state, and the difference between the two medians — the conformational change DOR must pay for — is larger than wild type (129 Å³) for all three genotypes whose ΔΔGbind misses the phenotype: G190E (253 Å³), V106I+F227C and A98G+F227C (172 Å³ each) and K103N+M230L (163 Å³). In two of three G190E apo replicates the measured volume expands beyond what the measurement sphere can contain after roughly 20 ns; those frames are excluded from interpretation.</w:t>
       </w:r>
     </w:p>
     <w:sectPr>

</xml_diff>